<commit_message>
fix(docs): correct LLM model labels in architecture_diagram.docx
Section ④ header, description, and both table rows (prototype + production)
incorrectly named GPT-4o-mini as the main agent model; actual AGENT_MODEL
in config.py is gpt-4o. Safety Gate correctly remains GPT-4o-mini.

Co-Authored-By: Claude Sonnet 4.6 <noreply@anthropic.com>
</commit_message>
<xml_diff>
--- a/docs/architecture_diagram.docx
+++ b/docs/architecture_diagram.docx
@@ -941,7 +941,7 @@
                 <w:color w:val="FFFFFF"/>
                 <w:sz w:val="17"/>
               </w:rPr>
-              <w:t>④  LLM ENGINE  —  OpenAI GPT-4o-mini</w:t>
+              <w:t>④  LLM ENGINE  —  OpenAI GPT-4o</w:t>
             </w:r>
           </w:p>
         </w:tc>
@@ -1027,7 +1027,7 @@
                 <w:color w:val="0D3A6E"/>
                 <w:sz w:val="16"/>
               </w:rPr>
-              <w:t>▸  GPT-4o-mini: cost-effective, strong instruction-following</w:t>
+              <w:t>▸  GPT-4o: strong reasoning &amp; tool-call accuracy</w:t>
             </w:r>
           </w:p>
           <w:p>
@@ -2737,7 +2737,7 @@
                 <w:color w:val="0D3050"/>
                 <w:sz w:val="17"/>
               </w:rPr>
-              <w:t>OpenAI GPT-4o-mini</w:t>
+              <w:t>GPT-4o (agent) · GPT-4o-mini (safety)</w:t>
             </w:r>
           </w:p>
           <w:p>
@@ -2787,7 +2787,7 @@
                 <w:color w:val="0D3020"/>
                 <w:sz w:val="17"/>
               </w:rPr>
-              <w:t>OpenAI GPT-4o-mini</w:t>
+              <w:t>GPT-4o (agent) · GPT-4o-mini (safety)</w:t>
             </w:r>
           </w:p>
           <w:p>

</xml_diff>